<commit_message>
Update task documentation to reflect completion status for favorite actions
</commit_message>
<xml_diff>
--- a/Docs/Phase IV Tasks Done.docx
+++ b/Docs/Phase IV Tasks Done.docx
@@ -1568,7 +1568,39 @@
                 <w:sz w:val="20"/>
                 <w:szCs w:val="20"/>
               </w:rPr>
-              <w:t>Create =&gt; add to favourite, read =&gt; fetch user data, update =&gt; increment score when be happy, delete =&gt; remove favourite (sad, Gesture, TUIO)</w:t>
+              <w:t>Create =&gt; add to favourite</w:t>
+            </w:r>
+            <w:r>
+              <w:rPr>
+                <w:rFonts w:asciiTheme="majorBidi" w:hAnsiTheme="majorBidi" w:cstheme="majorBidi"/>
+                <w:sz w:val="20"/>
+                <w:szCs w:val="20"/>
+              </w:rPr>
+              <w:t>[done]</w:t>
+            </w:r>
+            <w:r>
+              <w:rPr>
+                <w:rFonts w:asciiTheme="majorBidi" w:hAnsiTheme="majorBidi" w:cstheme="majorBidi"/>
+                <w:sz w:val="20"/>
+                <w:szCs w:val="20"/>
+              </w:rPr>
+              <w:t>, read =&gt; fetch user data</w:t>
+            </w:r>
+            <w:r>
+              <w:rPr>
+                <w:rFonts w:asciiTheme="majorBidi" w:hAnsiTheme="majorBidi" w:cstheme="majorBidi"/>
+                <w:sz w:val="20"/>
+                <w:szCs w:val="20"/>
+              </w:rPr>
+              <w:t xml:space="preserve"> [done]</w:t>
+            </w:r>
+            <w:r>
+              <w:rPr>
+                <w:rFonts w:asciiTheme="majorBidi" w:hAnsiTheme="majorBidi" w:cstheme="majorBidi"/>
+                <w:sz w:val="20"/>
+                <w:szCs w:val="20"/>
+              </w:rPr>
+              <w:t>, update =&gt; increment score when be happy, delete =&gt; remove favourite (sad, Gesture, TUIO)</w:t>
             </w:r>
           </w:p>
         </w:tc>
@@ -2458,7 +2490,6 @@
                 <w:shd w:val="clear" w:color="auto" w:fill="FFFFFF"/>
               </w:rPr>
             </w:pPr>
-            <w:proofErr w:type="gramStart"/>
             <w:r>
               <w:rPr>
                 <w:rFonts w:asciiTheme="majorBidi" w:hAnsiTheme="majorBidi" w:cstheme="majorBidi"/>
@@ -2469,20 +2500,7 @@
                 <w:szCs w:val="20"/>
                 <w:shd w:val="clear" w:color="auto" w:fill="FFFFFF"/>
               </w:rPr>
-              <w:t>Bonus</w:t>
-            </w:r>
-            <w:proofErr w:type="gramEnd"/>
-            <w:r>
-              <w:rPr>
-                <w:rFonts w:asciiTheme="majorBidi" w:hAnsiTheme="majorBidi" w:cstheme="majorBidi"/>
-                <w:b/>
-                <w:bCs/>
-                <w:color w:val="222222"/>
-                <w:sz w:val="20"/>
-                <w:szCs w:val="20"/>
-                <w:shd w:val="clear" w:color="auto" w:fill="FFFFFF"/>
-              </w:rPr>
-              <w:t xml:space="preserve"> enrich idea</w:t>
+              <w:t>Bonus enrich idea</w:t>
             </w:r>
           </w:p>
         </w:tc>

</xml_diff>

<commit_message>
Update Phase IV Tasks document; enhance clarity and correct formatting
</commit_message>
<xml_diff>
--- a/Docs/Phase IV Tasks Done.docx
+++ b/Docs/Phase IV Tasks Done.docx
@@ -1305,6 +1305,24 @@
               </w:rPr>
               <w:t>!!!!!!!!!!!!!!!!!</w:t>
             </w:r>
+            <w:r>
+              <w:rPr>
+                <w:rFonts w:asciiTheme="majorBidi" w:hAnsiTheme="majorBidi" w:cstheme="majorBidi"/>
+                <w:sz w:val="20"/>
+                <w:szCs w:val="20"/>
+              </w:rPr>
+              <w:t xml:space="preserve"> </w:t>
+            </w:r>
+            <w:proofErr w:type="spellStart"/>
+            <w:r>
+              <w:rPr>
+                <w:rFonts w:asciiTheme="majorBidi" w:hAnsiTheme="majorBidi" w:cstheme="majorBidi"/>
+                <w:sz w:val="20"/>
+                <w:szCs w:val="20"/>
+              </w:rPr>
+              <w:t>monem</w:t>
+            </w:r>
+            <w:proofErr w:type="spellEnd"/>
           </w:p>
         </w:tc>
         <w:tc>
@@ -1338,6 +1356,27 @@
               </w:rPr>
               <w:br/>
               <w:t>? not understandable</w:t>
+            </w:r>
+          </w:p>
+          <w:p>
+            <w:pPr>
+              <w:jc w:val="center"/>
+              <w:rPr>
+                <w:rFonts w:asciiTheme="majorBidi" w:hAnsiTheme="majorBidi" w:cstheme="majorBidi"/>
+              </w:rPr>
+            </w:pPr>
+          </w:p>
+          <w:p>
+            <w:pPr>
+              <w:rPr>
+                <w:rFonts w:asciiTheme="majorBidi" w:hAnsiTheme="majorBidi" w:cstheme="majorBidi"/>
+              </w:rPr>
+            </w:pPr>
+            <w:r>
+              <w:rPr>
+                <w:rFonts w:asciiTheme="majorBidi" w:hAnsiTheme="majorBidi" w:cstheme="majorBidi"/>
+              </w:rPr>
+              <w:t>@ we need idea</w:t>
             </w:r>
           </w:p>
         </w:tc>
@@ -1461,6 +1500,24 @@
               </w:rPr>
               <w:t>]</w:t>
             </w:r>
+            <w:r>
+              <w:rPr>
+                <w:rFonts w:asciiTheme="majorBidi" w:hAnsiTheme="majorBidi" w:cstheme="majorBidi"/>
+                <w:sz w:val="20"/>
+                <w:szCs w:val="20"/>
+              </w:rPr>
+              <w:t xml:space="preserve"> </w:t>
+            </w:r>
+            <w:proofErr w:type="spellStart"/>
+            <w:r>
+              <w:rPr>
+                <w:rFonts w:asciiTheme="majorBidi" w:hAnsiTheme="majorBidi" w:cstheme="majorBidi"/>
+                <w:sz w:val="20"/>
+                <w:szCs w:val="20"/>
+              </w:rPr>
+              <w:t>monem</w:t>
+            </w:r>
+            <w:proofErr w:type="spellEnd"/>
           </w:p>
         </w:tc>
         <w:tc>
@@ -1602,6 +1659,14 @@
               </w:rPr>
               <w:t>, update =&gt; increment score when be happy, delete =&gt; remove favourite (sad, Gesture, TUIO)</w:t>
             </w:r>
+            <w:r>
+              <w:rPr>
+                <w:rFonts w:asciiTheme="majorBidi" w:hAnsiTheme="majorBidi" w:cstheme="majorBidi"/>
+                <w:sz w:val="20"/>
+                <w:szCs w:val="20"/>
+              </w:rPr>
+              <w:t xml:space="preserve"> [DONE]</w:t>
+            </w:r>
           </w:p>
         </w:tc>
         <w:tc>
@@ -1956,7 +2021,7 @@
                 <w:sz w:val="20"/>
                 <w:szCs w:val="20"/>
               </w:rPr>
-              <w:t>Identify known users</w:t>
+              <w:t>@@@@@@</w:t>
             </w:r>
           </w:p>
         </w:tc>
@@ -2074,7 +2139,7 @@
                 <w:sz w:val="20"/>
                 <w:szCs w:val="20"/>
               </w:rPr>
-              <w:t>understandable</w:t>
+              <w:t>Remaining: Adaptive interface</w:t>
             </w:r>
           </w:p>
         </w:tc>
@@ -2176,6 +2241,14 @@
                 <w:szCs w:val="20"/>
               </w:rPr>
             </w:pPr>
+            <w:r>
+              <w:rPr>
+                <w:rFonts w:asciiTheme="majorBidi" w:hAnsiTheme="majorBidi" w:cstheme="majorBidi"/>
+                <w:sz w:val="20"/>
+                <w:szCs w:val="20"/>
+              </w:rPr>
+              <w:t>Gaze Heatmap</w:t>
+            </w:r>
           </w:p>
         </w:tc>
         <w:tc>
@@ -2560,7 +2633,33 @@
                 <w:sz w:val="20"/>
                 <w:szCs w:val="20"/>
               </w:rPr>
-              <w:t xml:space="preserve">Report of Favourites items </w:t>
+              <w:t xml:space="preserve">Report of </w:t>
+            </w:r>
+            <w:proofErr w:type="spellStart"/>
+            <w:r>
+              <w:rPr>
+                <w:rFonts w:asciiTheme="majorBidi" w:hAnsiTheme="majorBidi" w:cstheme="majorBidi"/>
+                <w:sz w:val="20"/>
+                <w:szCs w:val="20"/>
+              </w:rPr>
+              <w:t>Favorites</w:t>
+            </w:r>
+            <w:proofErr w:type="spellEnd"/>
+            <w:r>
+              <w:rPr>
+                <w:rFonts w:asciiTheme="majorBidi" w:hAnsiTheme="majorBidi" w:cstheme="majorBidi"/>
+                <w:sz w:val="20"/>
+                <w:szCs w:val="20"/>
+              </w:rPr>
+              <w:t xml:space="preserve"> </w:t>
+            </w:r>
+            <w:r>
+              <w:rPr>
+                <w:rFonts w:asciiTheme="majorBidi" w:hAnsiTheme="majorBidi" w:cstheme="majorBidi"/>
+                <w:sz w:val="20"/>
+                <w:szCs w:val="20"/>
+              </w:rPr>
+              <w:t xml:space="preserve">items </w:t>
             </w:r>
           </w:p>
           <w:p>
@@ -3454,6 +3553,230 @@
       </w:rPr>
     </w:lvl>
   </w:abstractNum>
+  <w:abstractNum w:abstractNumId="3" w15:restartNumberingAfterBreak="0">
+    <w:nsid w:val="5F8C4A33"/>
+    <w:multiLevelType w:val="hybridMultilevel"/>
+    <w:tmpl w:val="BF8A9260"/>
+    <w:lvl w:ilvl="0" w:tplc="B2C01526">
+      <w:numFmt w:val="bullet"/>
+      <w:lvlText w:val="-"/>
+      <w:lvlJc w:val="left"/>
+      <w:pPr>
+        <w:ind w:left="1080" w:hanging="360"/>
+      </w:pPr>
+      <w:rPr>
+        <w:rFonts w:ascii="Times New Roman" w:eastAsiaTheme="minorHAnsi" w:hAnsi="Times New Roman" w:cs="Times New Roman" w:hint="default"/>
+      </w:rPr>
+    </w:lvl>
+    <w:lvl w:ilvl="1" w:tplc="04090003" w:tentative="1">
+      <w:start w:val="1"/>
+      <w:numFmt w:val="bullet"/>
+      <w:lvlText w:val="o"/>
+      <w:lvlJc w:val="left"/>
+      <w:pPr>
+        <w:ind w:left="1800" w:hanging="360"/>
+      </w:pPr>
+      <w:rPr>
+        <w:rFonts w:ascii="Courier New" w:hAnsi="Courier New" w:cs="Courier New" w:hint="default"/>
+      </w:rPr>
+    </w:lvl>
+    <w:lvl w:ilvl="2" w:tplc="04090005" w:tentative="1">
+      <w:start w:val="1"/>
+      <w:numFmt w:val="bullet"/>
+      <w:lvlText w:val=""/>
+      <w:lvlJc w:val="left"/>
+      <w:pPr>
+        <w:ind w:left="2520" w:hanging="360"/>
+      </w:pPr>
+      <w:rPr>
+        <w:rFonts w:ascii="Wingdings" w:hAnsi="Wingdings" w:hint="default"/>
+      </w:rPr>
+    </w:lvl>
+    <w:lvl w:ilvl="3" w:tplc="04090001" w:tentative="1">
+      <w:start w:val="1"/>
+      <w:numFmt w:val="bullet"/>
+      <w:lvlText w:val=""/>
+      <w:lvlJc w:val="left"/>
+      <w:pPr>
+        <w:ind w:left="3240" w:hanging="360"/>
+      </w:pPr>
+      <w:rPr>
+        <w:rFonts w:ascii="Symbol" w:hAnsi="Symbol" w:hint="default"/>
+      </w:rPr>
+    </w:lvl>
+    <w:lvl w:ilvl="4" w:tplc="04090003" w:tentative="1">
+      <w:start w:val="1"/>
+      <w:numFmt w:val="bullet"/>
+      <w:lvlText w:val="o"/>
+      <w:lvlJc w:val="left"/>
+      <w:pPr>
+        <w:ind w:left="3960" w:hanging="360"/>
+      </w:pPr>
+      <w:rPr>
+        <w:rFonts w:ascii="Courier New" w:hAnsi="Courier New" w:cs="Courier New" w:hint="default"/>
+      </w:rPr>
+    </w:lvl>
+    <w:lvl w:ilvl="5" w:tplc="04090005" w:tentative="1">
+      <w:start w:val="1"/>
+      <w:numFmt w:val="bullet"/>
+      <w:lvlText w:val=""/>
+      <w:lvlJc w:val="left"/>
+      <w:pPr>
+        <w:ind w:left="4680" w:hanging="360"/>
+      </w:pPr>
+      <w:rPr>
+        <w:rFonts w:ascii="Wingdings" w:hAnsi="Wingdings" w:hint="default"/>
+      </w:rPr>
+    </w:lvl>
+    <w:lvl w:ilvl="6" w:tplc="04090001" w:tentative="1">
+      <w:start w:val="1"/>
+      <w:numFmt w:val="bullet"/>
+      <w:lvlText w:val=""/>
+      <w:lvlJc w:val="left"/>
+      <w:pPr>
+        <w:ind w:left="5400" w:hanging="360"/>
+      </w:pPr>
+      <w:rPr>
+        <w:rFonts w:ascii="Symbol" w:hAnsi="Symbol" w:hint="default"/>
+      </w:rPr>
+    </w:lvl>
+    <w:lvl w:ilvl="7" w:tplc="04090003" w:tentative="1">
+      <w:start w:val="1"/>
+      <w:numFmt w:val="bullet"/>
+      <w:lvlText w:val="o"/>
+      <w:lvlJc w:val="left"/>
+      <w:pPr>
+        <w:ind w:left="6120" w:hanging="360"/>
+      </w:pPr>
+      <w:rPr>
+        <w:rFonts w:ascii="Courier New" w:hAnsi="Courier New" w:cs="Courier New" w:hint="default"/>
+      </w:rPr>
+    </w:lvl>
+    <w:lvl w:ilvl="8" w:tplc="04090005" w:tentative="1">
+      <w:start w:val="1"/>
+      <w:numFmt w:val="bullet"/>
+      <w:lvlText w:val=""/>
+      <w:lvlJc w:val="left"/>
+      <w:pPr>
+        <w:ind w:left="6840" w:hanging="360"/>
+      </w:pPr>
+      <w:rPr>
+        <w:rFonts w:ascii="Wingdings" w:hAnsi="Wingdings" w:hint="default"/>
+      </w:rPr>
+    </w:lvl>
+  </w:abstractNum>
+  <w:abstractNum w:abstractNumId="4" w15:restartNumberingAfterBreak="0">
+    <w:nsid w:val="66A35384"/>
+    <w:multiLevelType w:val="hybridMultilevel"/>
+    <w:tmpl w:val="833C1E2C"/>
+    <w:lvl w:ilvl="0" w:tplc="1468479C">
+      <w:numFmt w:val="bullet"/>
+      <w:lvlText w:val=""/>
+      <w:lvlJc w:val="left"/>
+      <w:pPr>
+        <w:ind w:left="720" w:hanging="360"/>
+      </w:pPr>
+      <w:rPr>
+        <w:rFonts w:ascii="Symbol" w:eastAsiaTheme="minorHAnsi" w:hAnsi="Symbol" w:cstheme="majorBidi" w:hint="default"/>
+      </w:rPr>
+    </w:lvl>
+    <w:lvl w:ilvl="1" w:tplc="04090003" w:tentative="1">
+      <w:start w:val="1"/>
+      <w:numFmt w:val="bullet"/>
+      <w:lvlText w:val="o"/>
+      <w:lvlJc w:val="left"/>
+      <w:pPr>
+        <w:ind w:left="1440" w:hanging="360"/>
+      </w:pPr>
+      <w:rPr>
+        <w:rFonts w:ascii="Courier New" w:hAnsi="Courier New" w:cs="Courier New" w:hint="default"/>
+      </w:rPr>
+    </w:lvl>
+    <w:lvl w:ilvl="2" w:tplc="04090005" w:tentative="1">
+      <w:start w:val="1"/>
+      <w:numFmt w:val="bullet"/>
+      <w:lvlText w:val=""/>
+      <w:lvlJc w:val="left"/>
+      <w:pPr>
+        <w:ind w:left="2160" w:hanging="360"/>
+      </w:pPr>
+      <w:rPr>
+        <w:rFonts w:ascii="Wingdings" w:hAnsi="Wingdings" w:hint="default"/>
+      </w:rPr>
+    </w:lvl>
+    <w:lvl w:ilvl="3" w:tplc="04090001" w:tentative="1">
+      <w:start w:val="1"/>
+      <w:numFmt w:val="bullet"/>
+      <w:lvlText w:val=""/>
+      <w:lvlJc w:val="left"/>
+      <w:pPr>
+        <w:ind w:left="2880" w:hanging="360"/>
+      </w:pPr>
+      <w:rPr>
+        <w:rFonts w:ascii="Symbol" w:hAnsi="Symbol" w:hint="default"/>
+      </w:rPr>
+    </w:lvl>
+    <w:lvl w:ilvl="4" w:tplc="04090003" w:tentative="1">
+      <w:start w:val="1"/>
+      <w:numFmt w:val="bullet"/>
+      <w:lvlText w:val="o"/>
+      <w:lvlJc w:val="left"/>
+      <w:pPr>
+        <w:ind w:left="3600" w:hanging="360"/>
+      </w:pPr>
+      <w:rPr>
+        <w:rFonts w:ascii="Courier New" w:hAnsi="Courier New" w:cs="Courier New" w:hint="default"/>
+      </w:rPr>
+    </w:lvl>
+    <w:lvl w:ilvl="5" w:tplc="04090005" w:tentative="1">
+      <w:start w:val="1"/>
+      <w:numFmt w:val="bullet"/>
+      <w:lvlText w:val=""/>
+      <w:lvlJc w:val="left"/>
+      <w:pPr>
+        <w:ind w:left="4320" w:hanging="360"/>
+      </w:pPr>
+      <w:rPr>
+        <w:rFonts w:ascii="Wingdings" w:hAnsi="Wingdings" w:hint="default"/>
+      </w:rPr>
+    </w:lvl>
+    <w:lvl w:ilvl="6" w:tplc="04090001" w:tentative="1">
+      <w:start w:val="1"/>
+      <w:numFmt w:val="bullet"/>
+      <w:lvlText w:val=""/>
+      <w:lvlJc w:val="left"/>
+      <w:pPr>
+        <w:ind w:left="5040" w:hanging="360"/>
+      </w:pPr>
+      <w:rPr>
+        <w:rFonts w:ascii="Symbol" w:hAnsi="Symbol" w:hint="default"/>
+      </w:rPr>
+    </w:lvl>
+    <w:lvl w:ilvl="7" w:tplc="04090003" w:tentative="1">
+      <w:start w:val="1"/>
+      <w:numFmt w:val="bullet"/>
+      <w:lvlText w:val="o"/>
+      <w:lvlJc w:val="left"/>
+      <w:pPr>
+        <w:ind w:left="5760" w:hanging="360"/>
+      </w:pPr>
+      <w:rPr>
+        <w:rFonts w:ascii="Courier New" w:hAnsi="Courier New" w:cs="Courier New" w:hint="default"/>
+      </w:rPr>
+    </w:lvl>
+    <w:lvl w:ilvl="8" w:tplc="04090005" w:tentative="1">
+      <w:start w:val="1"/>
+      <w:numFmt w:val="bullet"/>
+      <w:lvlText w:val=""/>
+      <w:lvlJc w:val="left"/>
+      <w:pPr>
+        <w:ind w:left="6480" w:hanging="360"/>
+      </w:pPr>
+      <w:rPr>
+        <w:rFonts w:ascii="Wingdings" w:hAnsi="Wingdings" w:hint="default"/>
+      </w:rPr>
+    </w:lvl>
+  </w:abstractNum>
   <w:num w:numId="1" w16cid:durableId="962729179">
     <w:abstractNumId w:val="1"/>
   </w:num>
@@ -3462,6 +3785,12 @@
   </w:num>
   <w:num w:numId="3" w16cid:durableId="994182421">
     <w:abstractNumId w:val="0"/>
+  </w:num>
+  <w:num w:numId="4" w16cid:durableId="121046132">
+    <w:abstractNumId w:val="4"/>
+  </w:num>
+  <w:num w:numId="5" w16cid:durableId="1437016201">
+    <w:abstractNumId w:val="3"/>
   </w:num>
 </w:numbering>
 </file>

</xml_diff>

<commit_message>
Update Phase IV Tasks document; refine gesture actions and mark gaze heatmap as completed
</commit_message>
<xml_diff>
--- a/Docs/Phase IV Tasks Done.docx
+++ b/Docs/Phase IV Tasks Done.docx
@@ -384,7 +384,7 @@
                 <w:rFonts w:asciiTheme="majorBidi" w:hAnsiTheme="majorBidi" w:cstheme="majorBidi"/>
                 <w:sz w:val="20"/>
               </w:rPr>
-              <w:t>Project Name</w:t>
+              <w:t>Tasks to be done</w:t>
             </w:r>
           </w:p>
         </w:tc>
@@ -400,13 +400,6 @@
                 <w:sz w:val="16"/>
               </w:rPr>
             </w:pPr>
-            <w:r>
-              <w:rPr>
-                <w:rFonts w:asciiTheme="majorBidi" w:hAnsiTheme="majorBidi" w:cstheme="majorBidi"/>
-                <w:sz w:val="16"/>
-              </w:rPr>
-              <w:t>Smart 3D Museum</w:t>
-            </w:r>
           </w:p>
         </w:tc>
       </w:tr>
@@ -431,7 +424,7 @@
                 <w:rFonts w:asciiTheme="majorBidi" w:hAnsiTheme="majorBidi" w:cstheme="majorBidi"/>
                 <w:sz w:val="20"/>
               </w:rPr>
-              <w:t>GitHub Link</w:t>
+              <w:t>Gestures</w:t>
             </w:r>
           </w:p>
         </w:tc>
@@ -448,13 +441,6 @@
                 <w:lang w:val="en-US"/>
               </w:rPr>
             </w:pPr>
-            <w:r>
-              <w:rPr>
-                <w:rFonts w:asciiTheme="majorBidi" w:hAnsiTheme="majorBidi" w:cstheme="majorBidi"/>
-                <w:sz w:val="16"/>
-              </w:rPr>
-              <w:t>https://github.com/MON3EMPASHA/MuseSense-HCI</w:t>
-            </w:r>
           </w:p>
         </w:tc>
       </w:tr>
@@ -474,13 +460,6 @@
                 <w:sz w:val="20"/>
               </w:rPr>
             </w:pPr>
-            <w:r>
-              <w:rPr>
-                <w:rFonts w:asciiTheme="majorBidi" w:hAnsiTheme="majorBidi" w:cstheme="majorBidi"/>
-                <w:sz w:val="20"/>
-              </w:rPr>
-              <w:t>Trello link</w:t>
-            </w:r>
           </w:p>
         </w:tc>
         <w:tc>
@@ -495,13 +474,6 @@
                 <w:sz w:val="16"/>
               </w:rPr>
             </w:pPr>
-            <w:r>
-              <w:rPr>
-                <w:rFonts w:asciiTheme="majorBidi" w:hAnsiTheme="majorBidi" w:cstheme="majorBidi"/>
-                <w:sz w:val="16"/>
-              </w:rPr>
-              <w:t>https://trello.com/b/78huSfTe/hci</w:t>
-            </w:r>
           </w:p>
         </w:tc>
       </w:tr>
@@ -563,15 +535,15 @@
     <w:tbl>
       <w:tblPr>
         <w:tblStyle w:val="GridTable1Light"/>
-        <w:tblW w:w="6705" w:type="dxa"/>
+        <w:tblW w:w="7200" w:type="dxa"/>
         <w:tblInd w:w="-725" w:type="dxa"/>
         <w:tblLook w:val="04A0" w:firstRow="1" w:lastRow="0" w:firstColumn="1" w:lastColumn="0" w:noHBand="0" w:noVBand="1"/>
       </w:tblPr>
       <w:tblGrid>
         <w:gridCol w:w="1034"/>
         <w:gridCol w:w="1939"/>
-        <w:gridCol w:w="2917"/>
-        <w:gridCol w:w="815"/>
+        <w:gridCol w:w="3237"/>
+        <w:gridCol w:w="990"/>
       </w:tblGrid>
       <w:tr>
         <w:trPr>
@@ -618,7 +590,7 @@
         </w:tc>
         <w:tc>
           <w:tcPr>
-            <w:tcW w:w="2917" w:type="dxa"/>
+            <w:tcW w:w="3237" w:type="dxa"/>
             <w:vAlign w:val="center"/>
           </w:tcPr>
           <w:p>
@@ -631,13 +603,13 @@
               </w:rPr>
             </w:pPr>
             <w:r>
-              <w:t>Signature</w:t>
-            </w:r>
-          </w:p>
-        </w:tc>
-        <w:tc>
-          <w:tcPr>
-            <w:tcW w:w="815" w:type="dxa"/>
+              <w:t>Gestures</w:t>
+            </w:r>
+          </w:p>
+        </w:tc>
+        <w:tc>
+          <w:tcPr>
+            <w:tcW w:w="990" w:type="dxa"/>
             <w:vAlign w:val="center"/>
           </w:tcPr>
           <w:p>
@@ -716,7 +688,7 @@
         </w:tc>
         <w:tc>
           <w:tcPr>
-            <w:tcW w:w="2917" w:type="dxa"/>
+            <w:tcW w:w="3237" w:type="dxa"/>
             <w:vAlign w:val="center"/>
           </w:tcPr>
           <w:p>
@@ -728,11 +700,25 @@
                 <w:lang w:val="en-US"/>
               </w:rPr>
             </w:pPr>
-          </w:p>
-        </w:tc>
-        <w:tc>
-          <w:tcPr>
-            <w:tcW w:w="815" w:type="dxa"/>
+            <w:r>
+              <w:rPr>
+                <w:rFonts w:asciiTheme="majorBidi" w:hAnsiTheme="majorBidi" w:cstheme="majorBidi"/>
+                <w:lang w:val="en-US"/>
+              </w:rPr>
+              <w:t>Left, right, circle</w:t>
+            </w:r>
+            <w:r>
+              <w:rPr>
+                <w:rFonts w:asciiTheme="majorBidi" w:hAnsiTheme="majorBidi" w:cstheme="majorBidi"/>
+                <w:lang w:val="en-US"/>
+              </w:rPr>
+              <w:t>, mute, dark</w:t>
+            </w:r>
+          </w:p>
+        </w:tc>
+        <w:tc>
+          <w:tcPr>
+            <w:tcW w:w="990" w:type="dxa"/>
             <w:vAlign w:val="center"/>
           </w:tcPr>
           <w:p>
@@ -799,7 +785,7 @@
         </w:tc>
         <w:tc>
           <w:tcPr>
-            <w:tcW w:w="2917" w:type="dxa"/>
+            <w:tcW w:w="3237" w:type="dxa"/>
             <w:vAlign w:val="center"/>
           </w:tcPr>
           <w:p>
@@ -807,15 +793,46 @@
               <w:jc w:val="center"/>
               <w:cnfStyle w:val="000000000000" w:firstRow="0" w:lastRow="0" w:firstColumn="0" w:lastColumn="0" w:oddVBand="0" w:evenVBand="0" w:oddHBand="0" w:evenHBand="0" w:firstRowFirstColumn="0" w:firstRowLastColumn="0" w:lastRowFirstColumn="0" w:lastRowLastColumn="0"/>
               <w:rPr>
+                <w:rFonts w:asciiTheme="majorBidi" w:hAnsiTheme="majorBidi" w:cstheme="majorBidi" w:hint="cs"/>
+                <w:rtl/>
+                <w:lang w:val="en-US" w:bidi="ar-EG"/>
+              </w:rPr>
+            </w:pPr>
+            <w:r>
+              <w:rPr>
                 <w:rFonts w:asciiTheme="majorBidi" w:hAnsiTheme="majorBidi" w:cstheme="majorBidi"/>
                 <w:lang w:val="en-US"/>
               </w:rPr>
-            </w:pPr>
-          </w:p>
-        </w:tc>
-        <w:tc>
-          <w:tcPr>
-            <w:tcW w:w="815" w:type="dxa"/>
+              <w:t xml:space="preserve">Add </w:t>
+            </w:r>
+            <w:proofErr w:type="spellStart"/>
+            <w:r>
+              <w:rPr>
+                <w:rFonts w:asciiTheme="majorBidi" w:hAnsiTheme="majorBidi" w:cstheme="majorBidi"/>
+                <w:lang w:val="en-US"/>
+              </w:rPr>
+              <w:t>favourtie</w:t>
+            </w:r>
+            <w:proofErr w:type="spellEnd"/>
+            <w:r>
+              <w:rPr>
+                <w:rFonts w:asciiTheme="majorBidi" w:hAnsiTheme="majorBidi" w:cstheme="majorBidi"/>
+                <w:lang w:val="en-US"/>
+              </w:rPr>
+              <w:t xml:space="preserve">, remove </w:t>
+            </w:r>
+            <w:r>
+              <w:rPr>
+                <w:rFonts w:asciiTheme="majorBidi" w:hAnsiTheme="majorBidi" w:cstheme="majorBidi"/>
+                <w:lang w:val="en-US"/>
+              </w:rPr>
+              <w:t>favorite</w:t>
+            </w:r>
+          </w:p>
+        </w:tc>
+        <w:tc>
+          <w:tcPr>
+            <w:tcW w:w="990" w:type="dxa"/>
             <w:vAlign w:val="center"/>
           </w:tcPr>
           <w:p>
@@ -882,7 +899,7 @@
         </w:tc>
         <w:tc>
           <w:tcPr>
-            <w:tcW w:w="2917" w:type="dxa"/>
+            <w:tcW w:w="3237" w:type="dxa"/>
             <w:vAlign w:val="center"/>
           </w:tcPr>
           <w:p>
@@ -898,7 +915,7 @@
         </w:tc>
         <w:tc>
           <w:tcPr>
-            <w:tcW w:w="815" w:type="dxa"/>
+            <w:tcW w:w="990" w:type="dxa"/>
             <w:vAlign w:val="center"/>
           </w:tcPr>
           <w:p>
@@ -954,11 +971,27 @@
                 <w:lang w:val="en-US"/>
               </w:rPr>
             </w:pPr>
-          </w:p>
-        </w:tc>
-        <w:tc>
-          <w:tcPr>
-            <w:tcW w:w="2917" w:type="dxa"/>
+            <w:r>
+              <w:rPr>
+                <w:rFonts w:asciiTheme="majorBidi" w:hAnsiTheme="majorBidi" w:cstheme="majorBidi"/>
+                <w:lang w:val="en-US"/>
+              </w:rPr>
+              <w:t xml:space="preserve">Remove </w:t>
+            </w:r>
+            <w:proofErr w:type="spellStart"/>
+            <w:r>
+              <w:rPr>
+                <w:rFonts w:asciiTheme="majorBidi" w:hAnsiTheme="majorBidi" w:cstheme="majorBidi"/>
+                <w:lang w:val="en-US"/>
+              </w:rPr>
+              <w:t>favourite</w:t>
+            </w:r>
+            <w:proofErr w:type="spellEnd"/>
+          </w:p>
+        </w:tc>
+        <w:tc>
+          <w:tcPr>
+            <w:tcW w:w="3237" w:type="dxa"/>
             <w:vAlign w:val="center"/>
           </w:tcPr>
           <w:p>
@@ -974,7 +1007,7 @@
         </w:tc>
         <w:tc>
           <w:tcPr>
-            <w:tcW w:w="815" w:type="dxa"/>
+            <w:tcW w:w="990" w:type="dxa"/>
             <w:vAlign w:val="center"/>
           </w:tcPr>
           <w:p>
@@ -1034,7 +1067,7 @@
         </w:tc>
         <w:tc>
           <w:tcPr>
-            <w:tcW w:w="2917" w:type="dxa"/>
+            <w:tcW w:w="3237" w:type="dxa"/>
             <w:vAlign w:val="center"/>
           </w:tcPr>
           <w:p>
@@ -1050,7 +1083,7 @@
         </w:tc>
         <w:tc>
           <w:tcPr>
-            <w:tcW w:w="815" w:type="dxa"/>
+            <w:tcW w:w="990" w:type="dxa"/>
             <w:vAlign w:val="center"/>
           </w:tcPr>
           <w:p>
@@ -1558,7 +1591,7 @@
             <w:r>
               <w:rPr>
                 <w:rFonts w:asciiTheme="majorBidi" w:hAnsiTheme="majorBidi" w:cstheme="majorBidi"/>
-                <w:color w:val="222222"/>
+                <w:color w:val="EE0000"/>
                 <w:sz w:val="20"/>
                 <w:szCs w:val="20"/>
                 <w:shd w:val="clear" w:color="auto" w:fill="FFFFFF"/>
@@ -1568,7 +1601,7 @@
             <w:r>
               <w:rPr>
                 <w:rFonts w:asciiTheme="majorBidi" w:hAnsiTheme="majorBidi" w:cstheme="majorBidi"/>
-                <w:color w:val="222222"/>
+                <w:color w:val="EE0000"/>
                 <w:sz w:val="20"/>
                 <w:szCs w:val="20"/>
                 <w:shd w:val="clear" w:color="auto" w:fill="FFFFFF"/>
@@ -1915,6 +1948,24 @@
               </w:rPr>
               <w:t>Gestures [left, right, love, toggle mute, toggle dark mode]</w:t>
             </w:r>
+            <w:r>
+              <w:rPr>
+                <w:rFonts w:asciiTheme="majorBidi" w:hAnsiTheme="majorBidi" w:cstheme="majorBidi"/>
+                <w:sz w:val="20"/>
+                <w:szCs w:val="20"/>
+              </w:rPr>
+              <w:t xml:space="preserve"> </w:t>
+            </w:r>
+            <w:proofErr w:type="spellStart"/>
+            <w:r>
+              <w:rPr>
+                <w:rFonts w:asciiTheme="majorBidi" w:hAnsiTheme="majorBidi" w:cstheme="majorBidi"/>
+                <w:sz w:val="20"/>
+                <w:szCs w:val="20"/>
+              </w:rPr>
+              <w:t>monem</w:t>
+            </w:r>
+            <w:proofErr w:type="spellEnd"/>
           </w:p>
         </w:tc>
         <w:tc>
@@ -2239,15 +2290,53 @@
                 <w:rFonts w:asciiTheme="majorBidi" w:hAnsiTheme="majorBidi" w:cstheme="majorBidi"/>
                 <w:sz w:val="20"/>
                 <w:szCs w:val="20"/>
-              </w:rPr>
-            </w:pPr>
-            <w:r>
-              <w:rPr>
-                <w:rFonts w:asciiTheme="majorBidi" w:hAnsiTheme="majorBidi" w:cstheme="majorBidi"/>
-                <w:sz w:val="20"/>
-                <w:szCs w:val="20"/>
-              </w:rPr>
-              <w:t>Gaze Heatmap</w:t>
+                <w:lang w:val="af-ZA"/>
+              </w:rPr>
+            </w:pPr>
+            <w:r>
+              <w:rPr>
+                <w:rFonts w:asciiTheme="majorBidi" w:hAnsiTheme="majorBidi" w:cstheme="majorBidi"/>
+                <w:sz w:val="20"/>
+                <w:szCs w:val="20"/>
+              </w:rPr>
+              <w:t xml:space="preserve">Gaze </w:t>
+            </w:r>
+            <w:proofErr w:type="gramStart"/>
+            <w:r>
+              <w:rPr>
+                <w:rFonts w:asciiTheme="majorBidi" w:hAnsiTheme="majorBidi" w:cstheme="majorBidi"/>
+                <w:sz w:val="20"/>
+                <w:szCs w:val="20"/>
+              </w:rPr>
+              <w:t>Heatmap</w:t>
+            </w:r>
+            <w:r>
+              <w:rPr>
+                <w:rFonts w:asciiTheme="majorBidi" w:hAnsiTheme="majorBidi" w:cstheme="majorBidi" w:hint="cs"/>
+                <w:sz w:val="20"/>
+                <w:szCs w:val="20"/>
+                <w:rtl/>
+              </w:rPr>
+              <w:t xml:space="preserve"> </w:t>
+            </w:r>
+            <w:r>
+              <w:rPr>
+                <w:rFonts w:asciiTheme="majorBidi" w:hAnsiTheme="majorBidi" w:cstheme="majorBidi"/>
+                <w:sz w:val="20"/>
+                <w:szCs w:val="20"/>
+                <w:lang w:val="af-ZA"/>
+              </w:rPr>
+              <w:t xml:space="preserve"> [</w:t>
+            </w:r>
+            <w:proofErr w:type="gramEnd"/>
+            <w:r>
+              <w:rPr>
+                <w:rFonts w:asciiTheme="majorBidi" w:hAnsiTheme="majorBidi" w:cstheme="majorBidi"/>
+                <w:sz w:val="20"/>
+                <w:szCs w:val="20"/>
+                <w:lang w:val="af-ZA"/>
+              </w:rPr>
+              <w:t>Done]</w:t>
             </w:r>
           </w:p>
         </w:tc>
@@ -2563,6 +2652,7 @@
                 <w:shd w:val="clear" w:color="auto" w:fill="FFFFFF"/>
               </w:rPr>
             </w:pPr>
+            <w:proofErr w:type="gramStart"/>
             <w:r>
               <w:rPr>
                 <w:rFonts w:asciiTheme="majorBidi" w:hAnsiTheme="majorBidi" w:cstheme="majorBidi"/>
@@ -2573,7 +2663,20 @@
                 <w:szCs w:val="20"/>
                 <w:shd w:val="clear" w:color="auto" w:fill="FFFFFF"/>
               </w:rPr>
-              <w:t>Bonus enrich idea</w:t>
+              <w:t>Bonus</w:t>
+            </w:r>
+            <w:proofErr w:type="gramEnd"/>
+            <w:r>
+              <w:rPr>
+                <w:rFonts w:asciiTheme="majorBidi" w:hAnsiTheme="majorBidi" w:cstheme="majorBidi"/>
+                <w:b/>
+                <w:bCs/>
+                <w:color w:val="222222"/>
+                <w:sz w:val="20"/>
+                <w:szCs w:val="20"/>
+                <w:shd w:val="clear" w:color="auto" w:fill="FFFFFF"/>
+              </w:rPr>
+              <w:t xml:space="preserve"> enrich idea</w:t>
             </w:r>
           </w:p>
         </w:tc>
@@ -2715,17 +2818,6 @@
           <w:lang w:val="en-US"/>
         </w:rPr>
       </w:pPr>
-      <w:r>
-        <w:rPr>
-          <w:rFonts w:asciiTheme="majorBidi" w:hAnsiTheme="majorBidi" w:cstheme="majorBidi"/>
-          <w:b/>
-          <w:bCs/>
-          <w:sz w:val="24"/>
-          <w:szCs w:val="28"/>
-          <w:lang w:val="en-US"/>
-        </w:rPr>
-        <w:t xml:space="preserve">Instructor Signature:  </w:t>
-      </w:r>
     </w:p>
     <w:sectPr>
       <w:headerReference w:type="default" r:id="rId7"/>

</xml_diff>

<commit_message>
Add session_reports.py for generating and saving session reports
- Implemented functions to create session directories, render artifact PNGs, and build artifact reports.
- Added functionality to save session summaries including gaze and emotion reports.
- Integrated context store and gaze session logger for user-specific data handling.
</commit_message>
<xml_diff>
--- a/Docs/Phase IV Tasks Done.docx
+++ b/Docs/Phase IV Tasks Done.docx
@@ -793,7 +793,7 @@
               <w:jc w:val="center"/>
               <w:cnfStyle w:val="000000000000" w:firstRow="0" w:lastRow="0" w:firstColumn="0" w:lastColumn="0" w:oddVBand="0" w:evenVBand="0" w:oddHBand="0" w:evenHBand="0" w:firstRowFirstColumn="0" w:firstRowLastColumn="0" w:lastRowFirstColumn="0" w:lastRowLastColumn="0"/>
               <w:rPr>
-                <w:rFonts w:asciiTheme="majorBidi" w:hAnsiTheme="majorBidi" w:cstheme="majorBidi" w:hint="cs"/>
+                <w:rFonts w:asciiTheme="majorBidi" w:hAnsiTheme="majorBidi" w:cstheme="majorBidi"/>
                 <w:rtl/>
                 <w:lang w:val="en-US" w:bidi="ar-EG"/>
               </w:rPr>
@@ -911,6 +911,13 @@
                 <w:lang w:val="en-US"/>
               </w:rPr>
             </w:pPr>
+            <w:r>
+              <w:rPr>
+                <w:rFonts w:asciiTheme="majorBidi" w:hAnsiTheme="majorBidi" w:cstheme="majorBidi"/>
+                <w:lang w:val="en-US"/>
+              </w:rPr>
+              <w:t>Export Favorite Report</w:t>
+            </w:r>
           </w:p>
         </w:tc>
         <w:tc>
@@ -1063,6 +1070,13 @@
                 <w:lang w:val="en-US"/>
               </w:rPr>
             </w:pPr>
+            <w:r>
+              <w:rPr>
+                <w:rFonts w:asciiTheme="majorBidi" w:hAnsiTheme="majorBidi" w:cstheme="majorBidi"/>
+                <w:lang w:val="en-US"/>
+              </w:rPr>
+              <w:t>Export Favorite Report</w:t>
+            </w:r>
           </w:p>
         </w:tc>
         <w:tc>
@@ -1885,17 +1899,7 @@
                 <w:szCs w:val="20"/>
                 <w:shd w:val="clear" w:color="auto" w:fill="FFFFFF"/>
               </w:rPr>
-              <w:t>(Skelton/Object/Laser)</w:t>
-            </w:r>
-            <w:r>
-              <w:rPr>
-                <w:rFonts w:asciiTheme="majorBidi" w:hAnsiTheme="majorBidi" w:cstheme="majorBidi"/>
-                <w:color w:val="222222"/>
-                <w:sz w:val="20"/>
-                <w:szCs w:val="20"/>
-                <w:shd w:val="clear" w:color="auto" w:fill="FFFFFF"/>
-              </w:rPr>
-              <w:t xml:space="preserve"> using 1 dollar in scenario</w:t>
+              <w:t>(Skelton/Object/Laser) using 1 dollar in scenario</w:t>
             </w:r>
           </w:p>
         </w:tc>
@@ -1946,15 +1950,7 @@
                 <w:sz w:val="20"/>
                 <w:szCs w:val="20"/>
               </w:rPr>
-              <w:t>Gestures [left, right, love, toggle mute, toggle dark mode]</w:t>
-            </w:r>
-            <w:r>
-              <w:rPr>
-                <w:rFonts w:asciiTheme="majorBidi" w:hAnsiTheme="majorBidi" w:cstheme="majorBidi"/>
-                <w:sz w:val="20"/>
-                <w:szCs w:val="20"/>
-              </w:rPr>
-              <w:t xml:space="preserve"> </w:t>
+              <w:t xml:space="preserve">Gestures [left, right, love, toggle mute, toggle dark mode] </w:t>
             </w:r>
             <w:proofErr w:type="spellStart"/>
             <w:r>

</xml_diff>